<commit_message>
InVEST UCM pipeline: ET fix, Gaussian convolution, canonical energy savings, updated REF_SCENARIOS, tightened chart axis
</commit_message>
<xml_diff>
--- a/REFERENCE.docx
+++ b/REFERENCE.docx
@@ -2,7 +2,7 @@
 <file path=word/document.xml><?xml version="1.0" encoding="utf-8"?>
 <w:document xmlns:w="http://schemas.openxmlformats.org/wordprocessingml/2006/main" xmlns:m="http://schemas.openxmlformats.org/officeDocument/2006/math" xmlns:r="http://schemas.openxmlformats.org/officeDocument/2006/relationships" xmlns:o="urn:schemas-microsoft-com:office:office" xmlns:v="urn:schemas-microsoft-com:vml" xmlns:w10="urn:schemas-microsoft-com:office:word" xmlns:a="http://schemas.openxmlformats.org/drawingml/2006/main" xmlns:pic="http://schemas.openxmlformats.org/drawingml/2006/picture" xmlns:wp="http://schemas.openxmlformats.org/drawingml/2006/wordprocessingDrawing">
   <w:body>
-    <w:bookmarkStart w:id="45" w:name="ecosystem-explorer-ui-reference"/>
+    <w:bookmarkStart w:id="46" w:name="ecosystem-explorer-ui-reference"/>
     <w:p>
       <w:pPr>
         <w:pStyle w:val="Heading1"/>
@@ -48,7 +48,7 @@
         <w:pStyle w:val="BodyText"/>
       </w:pPr>
       <w:r>
-        <w:t xml:space="preserve">Scenarios are generated by selecting a percentage of developed land and reallocating it across these categories. Results are computed using raster-based biophysical lookup tables and summarized at the city scale. Spatial patterns are simplified rather than explicitly optimized. The tool is designed for comparative exploration of tradeoffs rather than precise prediction.</w:t>
+        <w:t xml:space="preserve">Scenarios are generated by selecting a percentage of developed land and reallocating it across these categories. Results are calculated from land cover and soil data at the pixel level, then averaged across the city. Spatial patterns are simplified rather than explicitly optimized. The tool is designed for comparative exploration of tradeoffs rather than precise prediction.</w:t>
       </w:r>
     </w:p>
     <w:p>
@@ -373,16 +373,222 @@
       </w:r>
     </w:p>
     <w:bookmarkEnd w:id="13"/>
-    <w:bookmarkStart w:id="17" w:name="metric-cards-row-1-three-columns"/>
+    <w:bookmarkStart w:id="14" w:name="computation-architecture"/>
     <w:p>
       <w:pPr>
         <w:pStyle w:val="Heading2"/>
       </w:pPr>
       <w:r>
+        <w:t xml:space="preserve">Computation Architecture</w:t>
+      </w:r>
+    </w:p>
+    <w:p>
+      <w:pPr>
+        <w:pStyle w:val="FirstParagraph"/>
+      </w:pPr>
+      <w:r>
+        <w:t xml:space="preserve">The full raster model provides the detailed spatial biophysical calculations. The lookup table makes the app responsive. The surrogate model makes large-scale scenario search possible.</w:t>
+      </w:r>
+    </w:p>
+    <w:tbl>
+      <w:tblPr>
+        <w:tblStyle w:val="Table"/>
+        <w:tblW w:type="auto" w:w="0"/>
+        <w:tblLook w:firstRow="1" w:lastRow="0" w:firstColumn="0" w:lastColumn="0" w:noHBand="0" w:noVBand="0" w:val="0020"/>
+      </w:tblPr>
+      <w:tblGrid>
+        <w:gridCol w:w="3960"/>
+        <w:gridCol w:w="3960"/>
+      </w:tblGrid>
+      <w:tr>
+        <w:trPr>
+          <w:tblHeader w:val="on"/>
+        </w:trPr>
+        <w:tc>
+          <w:tcPr/>
+          <w:p>
+            <w:pPr>
+              <w:pStyle w:val="Compact"/>
+            </w:pPr>
+            <w:r>
+              <w:t xml:space="preserve">Layer</w:t>
+            </w:r>
+          </w:p>
+        </w:tc>
+        <w:tc>
+          <w:tcPr/>
+          <w:p>
+            <w:pPr>
+              <w:pStyle w:val="Compact"/>
+            </w:pPr>
+            <w:r>
+              <w:t xml:space="preserve">Why it exists</w:t>
+            </w:r>
+          </w:p>
+        </w:tc>
+      </w:tr>
+      <w:tr>
+        <w:tc>
+          <w:tcPr/>
+          <w:p>
+            <w:pPr>
+              <w:pStyle w:val="Compact"/>
+            </w:pPr>
+            <w:r>
+              <w:t xml:space="preserve">Full raster simulations</w:t>
+            </w:r>
+          </w:p>
+        </w:tc>
+        <w:tc>
+          <w:tcPr/>
+          <w:p>
+            <w:pPr>
+              <w:pStyle w:val="Compact"/>
+            </w:pPr>
+            <w:r>
+              <w:t xml:space="preserve">Realism</w:t>
+            </w:r>
+          </w:p>
+        </w:tc>
+      </w:tr>
+      <w:tr>
+        <w:tc>
+          <w:tcPr/>
+          <w:p>
+            <w:pPr>
+              <w:pStyle w:val="Compact"/>
+            </w:pPr>
+            <w:r>
+              <w:t xml:space="preserve">Lookup table</w:t>
+            </w:r>
+          </w:p>
+        </w:tc>
+        <w:tc>
+          <w:tcPr/>
+          <w:p>
+            <w:pPr>
+              <w:pStyle w:val="Compact"/>
+            </w:pPr>
+            <w:r>
+              <w:t xml:space="preserve">Speed</w:t>
+            </w:r>
+          </w:p>
+        </w:tc>
+      </w:tr>
+      <w:tr>
+        <w:tc>
+          <w:tcPr/>
+          <w:p>
+            <w:pPr>
+              <w:pStyle w:val="Compact"/>
+            </w:pPr>
+            <w:r>
+              <w:t xml:space="preserve">Surrogate model</w:t>
+            </w:r>
+          </w:p>
+        </w:tc>
+        <w:tc>
+          <w:tcPr/>
+          <w:p>
+            <w:pPr>
+              <w:pStyle w:val="Compact"/>
+            </w:pPr>
+            <w:r>
+              <w:t xml:space="preserve">Exploration</w:t>
+            </w:r>
+          </w:p>
+        </w:tc>
+      </w:tr>
+    </w:tbl>
+    <w:p>
+      <w:pPr>
+        <w:pStyle w:val="BodyText"/>
+      </w:pPr>
+      <w:r>
+        <w:t xml:space="preserve">The app combines three computational layers to balance realism and responsiveness:</w:t>
+      </w:r>
+    </w:p>
+    <w:p>
+      <w:pPr>
+        <w:numPr>
+          <w:ilvl w:val="0"/>
+          <w:numId w:val="1001"/>
+        </w:numPr>
+      </w:pPr>
+      <w:r>
+        <w:rPr>
+          <w:b/>
+          <w:bCs/>
+        </w:rPr>
+        <w:t xml:space="preserve">Full-resolution raster simulations (90 scenarios)</w:t>
+      </w:r>
+      <w:r>
+        <w:br/>
+      </w:r>
+      <w:r>
+        <w:t xml:space="preserve">Used to train the surrogate model. These scenarios are computed directly from the pixel-level land cover and soil rasters, covering 6 conversion levels × 15 allocation combinations.</w:t>
+      </w:r>
+    </w:p>
+    <w:p>
+      <w:pPr>
+        <w:numPr>
+          <w:ilvl w:val="0"/>
+          <w:numId w:val="1001"/>
+        </w:numPr>
+      </w:pPr>
+      <w:r>
+        <w:rPr>
+          <w:b/>
+          <w:bCs/>
+        </w:rPr>
+        <w:t xml:space="preserve">Precomputed lookup table (2,541 scenarios)</w:t>
+      </w:r>
+      <w:r>
+        <w:br/>
+      </w:r>
+      <w:r>
+        <w:t xml:space="preserve">Used for near-instant slider response during normal interaction. These scenarios are stored in memory at startup and retrieved directly rather than recomputed on every slider move.</w:t>
+      </w:r>
+    </w:p>
+    <w:p>
+      <w:pPr>
+        <w:numPr>
+          <w:ilvl w:val="0"/>
+          <w:numId w:val="1001"/>
+        </w:numPr>
+      </w:pPr>
+      <w:r>
+        <w:rPr>
+          <w:b/>
+          <w:bCs/>
+        </w:rPr>
+        <w:t xml:space="preserve">Runtime surrogate optimization (~10,000 candidate scenarios)</w:t>
+      </w:r>
+      <w:r>
+        <w:br/>
+      </w:r>
+      <w:r>
+        <w:t xml:space="preserve">During optimization, the app generates thousands of new candidate land-use combinations and evaluates them using the Random Forest surrogate model rather than the full raster simulation. This enables rapid search across a much wider range of scenarios than the lookup table covers.</w:t>
+      </w:r>
+    </w:p>
+    <w:p>
+      <w:r>
+        <w:pict>
+          <v:rect style="width:0;height:1.5pt" o:hralign="center" o:hrstd="t" o:hr="t"/>
+        </w:pict>
+      </w:r>
+    </w:p>
+    <w:bookmarkEnd w:id="14"/>
+    <w:bookmarkStart w:id="18" w:name="metric-cards-row-1-three-columns"/>
+    <w:p>
+      <w:pPr>
+        <w:pStyle w:val="Heading2"/>
+      </w:pPr>
+      <w:r>
         <w:t xml:space="preserve">Metric Cards — Row 1 (three columns)</w:t>
       </w:r>
     </w:p>
-    <w:bookmarkStart w:id="14" w:name="flood-risk-reduction"/>
+    <w:bookmarkStart w:id="15" w:name="flood-risk-reduction"/>
     <w:p>
       <w:pPr>
         <w:pStyle w:val="Heading3"/>
@@ -480,7 +686,7 @@
               <w:pStyle w:val="Compact"/>
             </w:pPr>
             <w:r>
-              <w:t xml:space="preserve">Computed as 100 minus the area-weighted average Curve Number across all pixels.</w:t>
+              <w:t xml:space="preserve">Computed as 100 minus the area-weighted average Curve Number across all pixels. Essentially, we turn the runoff score upside down so that a higher number always means a better result.</w:t>
             </w:r>
             <w:r>
               <w:t xml:space="preserve"> </w:t>
@@ -659,8 +865,8 @@
         </w:pict>
       </w:r>
     </w:p>
-    <w:bookmarkEnd w:id="14"/>
-    <w:bookmarkStart w:id="15" w:name="temperature-change"/>
+    <w:bookmarkEnd w:id="15"/>
+    <w:bookmarkStart w:id="16" w:name="temperature-change"/>
     <w:p>
       <w:pPr>
         <w:pStyle w:val="Heading3"/>
@@ -925,8 +1131,8 @@
         </w:pict>
       </w:r>
     </w:p>
-    <w:bookmarkEnd w:id="15"/>
-    <w:bookmarkStart w:id="16" w:name="runoff-volume"/>
+    <w:bookmarkEnd w:id="16"/>
+    <w:bookmarkStart w:id="17" w:name="runoff-volume"/>
     <w:p>
       <w:pPr>
         <w:pStyle w:val="Heading3"/>
@@ -1190,9 +1396,9 @@
         </w:pict>
       </w:r>
     </w:p>
-    <w:bookmarkEnd w:id="16"/>
     <w:bookmarkEnd w:id="17"/>
-    <w:bookmarkStart w:id="20" w:name="metric-cards-row-2-two-columns"/>
+    <w:bookmarkEnd w:id="18"/>
+    <w:bookmarkStart w:id="21" w:name="metric-cards-row-2-two-columns"/>
     <w:p>
       <w:pPr>
         <w:pStyle w:val="Heading2"/>
@@ -1201,7 +1407,7 @@
         <w:t xml:space="preserve">Metric Cards — Row 2 (two columns)</w:t>
       </w:r>
     </w:p>
-    <w:bookmarkStart w:id="18" w:name="food-production"/>
+    <w:bookmarkStart w:id="19" w:name="food-production"/>
     <w:p>
       <w:pPr>
         <w:pStyle w:val="Heading3"/>
@@ -1430,8 +1636,8 @@
         </w:pict>
       </w:r>
     </w:p>
-    <w:bookmarkEnd w:id="18"/>
-    <w:bookmarkStart w:id="19" w:name="est.-implementation-cost"/>
+    <w:bookmarkEnd w:id="19"/>
+    <w:bookmarkStart w:id="20" w:name="est.-implementation-cost"/>
     <w:p>
       <w:pPr>
         <w:pStyle w:val="Heading3"/>
@@ -1612,6 +1818,34 @@
           </w:p>
         </w:tc>
       </w:tr>
+      <w:tr>
+        <w:tc>
+          <w:tcPr/>
+          <w:p>
+            <w:pPr>
+              <w:pStyle w:val="Compact"/>
+            </w:pPr>
+            <w:r>
+              <w:rPr>
+                <w:b/>
+                <w:bCs/>
+              </w:rPr>
+              <w:t xml:space="preserve">Cost defaults</w:t>
+            </w:r>
+          </w:p>
+        </w:tc>
+        <w:tc>
+          <w:tcPr/>
+          <w:p>
+            <w:pPr>
+              <w:pStyle w:val="Compact"/>
+            </w:pPr>
+            <w:r>
+              <w:t xml:space="preserve">Default values ($50k/acre GI, $10k/acre FF, $5k/acre HD) are placeholder costs to show you how the math works — not sourced from specific studies. You should plug in your actual local budget numbers using the sliders.</w:t>
+            </w:r>
+          </w:p>
+        </w:tc>
+      </w:tr>
     </w:tbl>
     <w:p>
       <w:r>
@@ -1620,9 +1854,9 @@
         </w:pict>
       </w:r>
     </w:p>
-    <w:bookmarkEnd w:id="19"/>
     <w:bookmarkEnd w:id="20"/>
-    <w:bookmarkStart w:id="24" w:name="X829dc69744e10072c496dd2408a113055bf8004"/>
+    <w:bookmarkEnd w:id="21"/>
+    <w:bookmarkStart w:id="25" w:name="X829dc69744e10072c496dd2408a113055bf8004"/>
     <w:p>
       <w:pPr>
         <w:pStyle w:val="Heading2"/>
@@ -1673,7 +1907,7 @@
         <w:t xml:space="preserve">If you see N/A, it means one of two things: either the scenario has zero cost (no land was converted), or the scenario is performing worse than the current city baseline on that specific metric — for example, adding high-density development increases runoff rather than reducing it. Try adjusting the conversion mix toward green infrastructure or food forest to see cost-effectiveness values appear.</w:t>
       </w:r>
     </w:p>
-    <w:bookmarkStart w:id="21" w:name="cost-acre-foot-prevented"/>
+    <w:bookmarkStart w:id="22" w:name="cost-acre-foot-prevented"/>
     <w:p>
       <w:pPr>
         <w:pStyle w:val="Heading3"/>
@@ -1818,8 +2052,8 @@
         </w:pict>
       </w:r>
     </w:p>
-    <w:bookmarkEnd w:id="21"/>
-    <w:bookmarkStart w:id="22" w:name="cost-f-cooling"/>
+    <w:bookmarkEnd w:id="22"/>
+    <w:bookmarkStart w:id="23" w:name="cost-f-cooling"/>
     <w:p>
       <w:pPr>
         <w:pStyle w:val="Heading3"/>
@@ -1979,8 +2213,8 @@
         </w:pict>
       </w:r>
     </w:p>
-    <w:bookmarkEnd w:id="22"/>
-    <w:bookmarkStart w:id="23" w:name="cost-1000-people-fed"/>
+    <w:bookmarkEnd w:id="23"/>
+    <w:bookmarkStart w:id="24" w:name="cost-1000-people-fed"/>
     <w:p>
       <w:pPr>
         <w:pStyle w:val="Heading3"/>
@@ -2125,9 +2359,9 @@
         </w:pict>
       </w:r>
     </w:p>
-    <w:bookmarkEnd w:id="23"/>
     <w:bookmarkEnd w:id="24"/>
-    <w:bookmarkStart w:id="25" w:name="scenario-summary-text"/>
+    <w:bookmarkEnd w:id="25"/>
+    <w:bookmarkStart w:id="26" w:name="scenario-summary-text"/>
     <w:p>
       <w:pPr>
         <w:pStyle w:val="Heading2"/>
@@ -2321,8 +2555,8 @@
         </w:pict>
       </w:r>
     </w:p>
-    <w:bookmarkEnd w:id="25"/>
-    <w:bookmarkStart w:id="33" w:name="sidebar-controls"/>
+    <w:bookmarkEnd w:id="26"/>
+    <w:bookmarkStart w:id="34" w:name="sidebar-controls"/>
     <w:p>
       <w:pPr>
         <w:pStyle w:val="Heading2"/>
@@ -2331,7 +2565,7 @@
         <w:t xml:space="preserve">Sidebar Controls</w:t>
       </w:r>
     </w:p>
-    <w:bookmarkStart w:id="26" w:name="city"/>
+    <w:bookmarkStart w:id="27" w:name="city"/>
     <w:p>
       <w:pPr>
         <w:pStyle w:val="Heading3"/>
@@ -2494,8 +2728,8 @@
         </w:pict>
       </w:r>
     </w:p>
-    <w:bookmarkEnd w:id="26"/>
-    <w:bookmarkStart w:id="27" w:name="of-developed-land-to-convert"/>
+    <w:bookmarkEnd w:id="27"/>
+    <w:bookmarkStart w:id="28" w:name="of-developed-land-to-convert"/>
     <w:p>
       <w:pPr>
         <w:pStyle w:val="Heading3"/>
@@ -2634,8 +2868,8 @@
         </w:pict>
       </w:r>
     </w:p>
-    <w:bookmarkEnd w:id="27"/>
-    <w:bookmarkStart w:id="28" w:name="X9c690ec6fbca036e7a35955631a2d4edd57a06f"/>
+    <w:bookmarkEnd w:id="28"/>
+    <w:bookmarkStart w:id="29" w:name="X9c690ec6fbca036e7a35955631a2d4edd57a06f"/>
     <w:p>
       <w:pPr>
         <w:pStyle w:val="Heading3"/>
@@ -2733,7 +2967,7 @@
               <w:pStyle w:val="Compact"/>
             </w:pPr>
             <w:r>
-              <w:t xml:space="preserve">Splits the converted pixels into three groups. Green Infrastructure → NLCD 90 (woody wetlands). Food Forest → NLCD 41 (deciduous forest proxy). High Density → NLCD 24 (developed, high intensity).</w:t>
+              <w:t xml:space="preserve">Splits the converted pixels into three groups. Green Infrastructure → NLCD 90 (woody wetlands). Food Forest → NLCD 41 (deciduous forest proxy). High Density → NLCD 24 (developed, high intensity). Note: Green Infrastructure here refers specifically to woody wetlands (NLCD 90), not the full range of GI interventions such as rain gardens, bioswales, permeable pavement, or green roofs.</w:t>
             </w:r>
           </w:p>
         </w:tc>
@@ -2774,8 +3008,8 @@
         </w:pict>
       </w:r>
     </w:p>
-    <w:bookmarkEnd w:id="28"/>
-    <w:bookmarkStart w:id="29" w:name="X01958c88ecbed7474534ce71c96b96136f2ed52"/>
+    <w:bookmarkEnd w:id="29"/>
+    <w:bookmarkStart w:id="30" w:name="X01958c88ecbed7474534ce71c96b96136f2ed52"/>
     <w:p>
       <w:pPr>
         <w:pStyle w:val="Heading3"/>
@@ -2914,8 +3148,8 @@
         </w:pict>
       </w:r>
     </w:p>
-    <w:bookmarkEnd w:id="29"/>
-    <w:bookmarkStart w:id="30" w:name="target-high-heat-exposure-areas-toggle"/>
+    <w:bookmarkEnd w:id="30"/>
+    <w:bookmarkStart w:id="31" w:name="target-high-heat-exposure-areas-toggle"/>
     <w:p>
       <w:pPr>
         <w:pStyle w:val="Heading3"/>
@@ -3060,8 +3294,8 @@
         </w:pict>
       </w:r>
     </w:p>
-    <w:bookmarkEnd w:id="30"/>
-    <w:bookmarkStart w:id="31" w:name="example-scenario-buttons"/>
+    <w:bookmarkEnd w:id="31"/>
+    <w:bookmarkStart w:id="32" w:name="example-scenario-buttons"/>
     <w:p>
       <w:pPr>
         <w:pStyle w:val="Heading3"/>
@@ -3223,8 +3457,8 @@
         </w:pict>
       </w:r>
     </w:p>
-    <w:bookmarkEnd w:id="31"/>
-    <w:bookmarkStart w:id="32" w:name="smart-scenario-search-surrogate-model"/>
+    <w:bookmarkEnd w:id="32"/>
+    <w:bookmarkStart w:id="33" w:name="smart-scenario-search-surrogate-model"/>
     <w:p>
       <w:pPr>
         <w:pStyle w:val="Heading3"/>
@@ -3416,6 +3650,170 @@
         <w:pStyle w:val="BodyText"/>
       </w:pPr>
       <w:r>
+        <w:t xml:space="preserve">Most slider interactions use a dense precomputed lookup table (2,541 entries) for near-instant response. The surrogate model is separate and is used specifically for the optimizer’s rapid scenario search.</w:t>
+      </w:r>
+    </w:p>
+    <w:tbl>
+      <w:tblPr>
+        <w:tblStyle w:val="Table"/>
+        <w:tblW w:type="pct" w:w="5000"/>
+        <w:tblLayout w:type="fixed"/>
+        <w:tblLook w:firstRow="1" w:lastRow="0" w:firstColumn="0" w:lastColumn="0" w:noHBand="0" w:noVBand="0" w:val="0020"/>
+      </w:tblPr>
+      <w:tblGrid>
+        <w:gridCol w:w="2410"/>
+        <w:gridCol w:w="3099"/>
+        <w:gridCol w:w="2410"/>
+      </w:tblGrid>
+      <w:tr>
+        <w:trPr>
+          <w:tblHeader w:val="on"/>
+        </w:trPr>
+        <w:tc>
+          <w:tcPr/>
+          <w:p>
+            <w:pPr>
+              <w:pStyle w:val="Compact"/>
+            </w:pPr>
+            <w:r>
+              <w:t xml:space="preserve">Layer</w:t>
+            </w:r>
+          </w:p>
+        </w:tc>
+        <w:tc>
+          <w:tcPr/>
+          <w:p>
+            <w:pPr>
+              <w:pStyle w:val="Compact"/>
+            </w:pPr>
+            <w:r>
+              <w:t xml:space="preserve">Purpose</w:t>
+            </w:r>
+          </w:p>
+        </w:tc>
+        <w:tc>
+          <w:tcPr/>
+          <w:p>
+            <w:pPr>
+              <w:pStyle w:val="Compact"/>
+            </w:pPr>
+            <w:r>
+              <w:t xml:space="preserve">Scale</w:t>
+            </w:r>
+          </w:p>
+        </w:tc>
+      </w:tr>
+      <w:tr>
+        <w:tc>
+          <w:tcPr/>
+          <w:p>
+            <w:pPr>
+              <w:pStyle w:val="Compact"/>
+            </w:pPr>
+            <w:r>
+              <w:t xml:space="preserve">Full raster simulations</w:t>
+            </w:r>
+          </w:p>
+        </w:tc>
+        <w:tc>
+          <w:tcPr/>
+          <w:p>
+            <w:pPr>
+              <w:pStyle w:val="Compact"/>
+            </w:pPr>
+            <w:r>
+              <w:t xml:space="preserve">Generate training data for the surrogate</w:t>
+            </w:r>
+          </w:p>
+        </w:tc>
+        <w:tc>
+          <w:tcPr/>
+          <w:p>
+            <w:pPr>
+              <w:pStyle w:val="Compact"/>
+            </w:pPr>
+            <w:r>
+              <w:t xml:space="preserve">90 scenarios (6 conversion levels × 15 allocation combinations)</w:t>
+            </w:r>
+          </w:p>
+        </w:tc>
+      </w:tr>
+      <w:tr>
+        <w:tc>
+          <w:tcPr/>
+          <w:p>
+            <w:pPr>
+              <w:pStyle w:val="Compact"/>
+            </w:pPr>
+            <w:r>
+              <w:t xml:space="preserve">Dense lookup table</w:t>
+            </w:r>
+          </w:p>
+        </w:tc>
+        <w:tc>
+          <w:tcPr/>
+          <w:p>
+            <w:pPr>
+              <w:pStyle w:val="Compact"/>
+            </w:pPr>
+            <w:r>
+              <w:t xml:space="preserve">Fast interactive slider response</w:t>
+            </w:r>
+          </w:p>
+        </w:tc>
+        <w:tc>
+          <w:tcPr/>
+          <w:p>
+            <w:pPr>
+              <w:pStyle w:val="Compact"/>
+            </w:pPr>
+            <w:r>
+              <w:t xml:space="preserve">2,541 pre-computed entries</w:t>
+            </w:r>
+          </w:p>
+        </w:tc>
+      </w:tr>
+      <w:tr>
+        <w:tc>
+          <w:tcPr/>
+          <w:p>
+            <w:pPr>
+              <w:pStyle w:val="Compact"/>
+            </w:pPr>
+            <w:r>
+              <w:t xml:space="preserve">RF surrogate + optimizer</w:t>
+            </w:r>
+          </w:p>
+        </w:tc>
+        <w:tc>
+          <w:tcPr/>
+          <w:p>
+            <w:pPr>
+              <w:pStyle w:val="Compact"/>
+            </w:pPr>
+            <w:r>
+              <w:t xml:space="preserve">Rapid scenario search at query time</w:t>
+            </w:r>
+          </w:p>
+        </w:tc>
+        <w:tc>
+          <w:tcPr/>
+          <w:p>
+            <w:pPr>
+              <w:pStyle w:val="Compact"/>
+            </w:pPr>
+            <w:r>
+              <w:t xml:space="preserve">Predicts ~10,000 random samples per search</w:t>
+            </w:r>
+          </w:p>
+        </w:tc>
+      </w:tr>
+    </w:tbl>
+    <w:p>
+      <w:pPr>
+        <w:pStyle w:val="BodyText"/>
+      </w:pPr>
+      <w:r>
         <w:rPr>
           <w:b/>
           <w:bCs/>
@@ -3426,7 +3824,7 @@
         <w:t xml:space="preserve"> </w:t>
       </w:r>
       <w:r>
-        <w:t xml:space="preserve">The full biophysical model examines every pixel in the city to calculate runoff and cooling. While accurate, this is too slow for real-time exploration. The surrogate is a fast-response approximation trained on 150 full simulations, learning the main relationships well enough to approximate outcomes for 10,000 candidate scenarios in under a second — enabling real-time scenario search.</w:t>
+        <w:t xml:space="preserve">The surrogate model is trained on 90 full-resolution raster simulations spanning different land-use allocations. It learns the main relationships between land-use allocation, runoff, cooling, and food production, then rapidly estimates outcomes for new combinations without rerunning the full pixel-by-pixel model each time. This enables interactive exploration of ~10,000 candidate scenarios in under a second while remaining grounded in the detailed raster simulations.</w:t>
       </w:r>
     </w:p>
     <w:p>
@@ -3444,7 +3842,31 @@
         <w:t xml:space="preserve"> </w:t>
       </w:r>
       <w:r>
-        <w:t xml:space="preserve">The surrogate uses a Random Forest — an ensemble of 100 decision trees, each acting like an independent expert advisor. Each advisor examines your slider settings and makes a prediction based on patterns it observed during training.</w:t>
+        <w:t xml:space="preserve">The surrogate uses a Random Forest regression model — an ensemble of many decision trees, which can be thought of as learned flowcharts built from 90 precomputed full-resolution simulations spanning different land-use allocations. Each tree learns patterns in how land-use allocations affect runoff, cooling, and food production.</w:t>
+      </w:r>
+    </w:p>
+    <w:p>
+      <w:pPr>
+        <w:pStyle w:val="BodyText"/>
+      </w:pPr>
+      <w:r>
+        <w:t xml:space="preserve">For a new scenario, each tree generates an independent estimate based on learned threshold rules (for example, how outcomes change when green infrastructure exceeds a certain percentage). The forest then combines those estimates into a final prediction and uncertainty range.</w:t>
+      </w:r>
+    </w:p>
+    <w:p>
+      <w:pPr>
+        <w:pStyle w:val="BodyText"/>
+      </w:pPr>
+      <w:r>
+        <w:t xml:space="preserve">The surrogate does not replace the underlying raster model; it approximates the relationships learned from those full-resolution simulations to enable rapid exploration of new scenarios.</w:t>
+      </w:r>
+    </w:p>
+    <w:p>
+      <w:pPr>
+        <w:pStyle w:val="BodyText"/>
+      </w:pPr>
+      <w:r>
+        <w:t xml:space="preserve">At optimization time, the app generates ~10,000 random candidate scenarios and evaluates them using the surrogate model rather than the full raster simulation. This allows rapid exploration of the scenario space while keeping computation interactive. Only candidates meeting all three user-specified minimum thresholds are retained, and the top results are returned ranked by a balanced score across flood, cooling, and food metrics.</w:t>
       </w:r>
     </w:p>
     <w:p>
@@ -3452,7 +3874,7 @@
         <w:pStyle w:val="Compact"/>
         <w:numPr>
           <w:ilvl w:val="0"/>
-          <w:numId w:val="1001"/>
+          <w:numId w:val="1002"/>
         </w:numPr>
       </w:pPr>
       <w:r>
@@ -3466,7 +3888,7 @@
         <w:t xml:space="preserve"> </w:t>
       </w:r>
       <w:r>
-        <w:t xml:space="preserve">The average across all 100 advisors.</w:t>
+        <w:t xml:space="preserve">The average across all trees.</w:t>
       </w:r>
     </w:p>
     <w:p>
@@ -3474,7 +3896,7 @@
         <w:pStyle w:val="Compact"/>
         <w:numPr>
           <w:ilvl w:val="0"/>
-          <w:numId w:val="1001"/>
+          <w:numId w:val="1002"/>
         </w:numPr>
       </w:pPr>
       <w:r>
@@ -3488,7 +3910,7 @@
         <w:t xml:space="preserve"> </w:t>
       </w:r>
       <w:r>
-        <w:t xml:space="preserve">When all 100 advisors agree, error bars are small. When they disagree significantly, error bars grow — signalling that the model is extrapolating into territory it has seen little of during training.</w:t>
+        <w:t xml:space="preserve">When all trees agree, error bars are small. When they disagree significantly, error bars grow — signalling that the model is extrapolating into territory it has seen little of during training.</w:t>
       </w:r>
     </w:p>
     <w:p>
@@ -3566,7 +3988,29 @@
         <w:t xml:space="preserve"> </w:t>
       </w:r>
       <w:r>
-        <w:t xml:space="preserve">The optimizer is intended to identify promising regions of the scenario space rather than a single globally optimal solution. Always verify suggestions using the main sliders.</w:t>
+        <w:t xml:space="preserve">The optimizer is intended to identify promising regions of the scenario space — the most efficient tradeoffs, not a single best answer. Always verify suggestions using the main sliders.</w:t>
+      </w:r>
+      <w:r>
+        <w:t xml:space="preserve"> </w:t>
+      </w:r>
+      <w:r>
+        <w:t xml:space="preserve">-</w:t>
+      </w:r>
+      <w:r>
+        <w:t xml:space="preserve"> </w:t>
+      </w:r>
+      <w:r>
+        <w:rPr>
+          <w:b/>
+          <w:bCs/>
+        </w:rPr>
+        <w:t xml:space="preserve">High Density artifacts:</w:t>
+      </w:r>
+      <w:r>
+        <w:t xml:space="preserve"> </w:t>
+      </w:r>
+      <w:r>
+        <w:t xml:space="preserve">Suggestions containing small amounts of High Density development (e.g. 2–10%) may reflect surrogate approximation error rather than a genuine optimum — verify by setting High Density to 0% when applying suggestions.</w:t>
       </w:r>
       <w:r>
         <w:t xml:space="preserve"> </w:t>
@@ -3598,9 +4042,9 @@
         </w:pict>
       </w:r>
     </w:p>
-    <w:bookmarkEnd w:id="32"/>
     <w:bookmarkEnd w:id="33"/>
-    <w:bookmarkStart w:id="42" w:name="tradeoff-chart-tradeoff-analysis-tab"/>
+    <w:bookmarkEnd w:id="34"/>
+    <w:bookmarkStart w:id="43" w:name="tradeoff-chart-tradeoff-analysis-tab"/>
     <w:p>
       <w:pPr>
         <w:pStyle w:val="Heading2"/>
@@ -3617,7 +4061,7 @@
         <w:t xml:space="preserve">Built with Plotly. X and Y axes show the two primary ecological metrics; bubble size encodes food production for saved and optimized scenarios only.</w:t>
       </w:r>
     </w:p>
-    <w:bookmarkStart w:id="34" w:name="axes"/>
+    <w:bookmarkStart w:id="35" w:name="axes"/>
     <w:p>
       <w:pPr>
         <w:pStyle w:val="Heading3"/>
@@ -3734,8 +4178,8 @@
         </w:pict>
       </w:r>
     </w:p>
-    <w:bookmarkEnd w:id="34"/>
-    <w:bookmarkStart w:id="35" w:name="reference-benchmarks-colored-markers"/>
+    <w:bookmarkEnd w:id="35"/>
+    <w:bookmarkStart w:id="36" w:name="reference-benchmarks-colored-markers"/>
     <w:p>
       <w:pPr>
         <w:pStyle w:val="Heading3"/>
@@ -4067,8 +4511,8 @@
         </w:pict>
       </w:r>
     </w:p>
-    <w:bookmarkEnd w:id="35"/>
-    <w:bookmarkStart w:id="36" w:name="convex-hull-feasible-space"/>
+    <w:bookmarkEnd w:id="36"/>
+    <w:bookmarkStart w:id="37" w:name="convex-hull-feasible-space"/>
     <w:p>
       <w:pPr>
         <w:pStyle w:val="Heading3"/>
@@ -4216,8 +4660,8 @@
         </w:pict>
       </w:r>
     </w:p>
-    <w:bookmarkEnd w:id="36"/>
-    <w:bookmarkStart w:id="37" w:name="current-scenario-purple-star"/>
+    <w:bookmarkEnd w:id="37"/>
+    <w:bookmarkStart w:id="38" w:name="current-scenario-purple-star"/>
     <w:p>
       <w:pPr>
         <w:pStyle w:val="Heading3"/>
@@ -4241,8 +4685,8 @@
         </w:pict>
       </w:r>
     </w:p>
-    <w:bookmarkEnd w:id="37"/>
-    <w:bookmarkStart w:id="38" w:name="saved-scenarios-purple-circles"/>
+    <w:bookmarkEnd w:id="38"/>
+    <w:bookmarkStart w:id="39" w:name="saved-scenarios-purple-circles"/>
     <w:p>
       <w:pPr>
         <w:pStyle w:val="Heading3"/>
@@ -4287,8 +4731,8 @@
         </w:pict>
       </w:r>
     </w:p>
-    <w:bookmarkEnd w:id="38"/>
-    <w:bookmarkStart w:id="39" w:name="pareto-frontier-gold-markers-dashed-line"/>
+    <w:bookmarkEnd w:id="39"/>
+    <w:bookmarkStart w:id="40" w:name="pareto-frontier-gold-markers-dashed-line"/>
     <w:p>
       <w:pPr>
         <w:pStyle w:val="Heading3"/>
@@ -4358,7 +4802,7 @@
               <w:pStyle w:val="Compact"/>
             </w:pPr>
             <w:r>
-              <w:t xml:space="preserve">The subset of saved scenarios where no other saved scenario is strictly better on all three metrics simultaneously (flood, HM, food).</w:t>
+              <w:t xml:space="preserve">The subset of saved scenarios that trace the outer edge of achievable performance — ones where improving one outcome would require sacrificing another. Anything far from the frontier is outperformed by at least one other saved scenario on all three metrics.</w:t>
             </w:r>
           </w:p>
         </w:tc>
@@ -4451,19 +4895,7 @@
         <w:t xml:space="preserve"> </w:t>
       </w:r>
       <w:r>
-        <w:t xml:space="preserve">worth exploring further. Scenarios far from the frontier are being</w:t>
-      </w:r>
-      <w:r>
-        <w:t xml:space="preserve"> </w:t>
-      </w:r>
-      <w:r>
-        <w:t xml:space="preserve">‘outcompeted’</w:t>
-      </w:r>
-      <w:r>
-        <w:t xml:space="preserve"> </w:t>
-      </w:r>
-      <w:r>
-        <w:t xml:space="preserve">by at least one other saved scenario on all three metrics simultaneously.</w:t>
+        <w:t xml:space="preserve">worth exploring further. Scenarios far from the frontier are outperformed by at least one other saved scenario on all three metrics simultaneously.</w:t>
       </w:r>
     </w:p>
     <w:p>
@@ -4473,8 +4905,8 @@
         </w:pict>
       </w:r>
     </w:p>
-    <w:bookmarkEnd w:id="39"/>
-    <w:bookmarkStart w:id="40" w:name="optimized-suggestions-orange-diamonds"/>
+    <w:bookmarkEnd w:id="40"/>
+    <w:bookmarkStart w:id="41" w:name="optimized-suggestions-orange-diamonds"/>
     <w:p>
       <w:pPr>
         <w:pStyle w:val="Heading3"/>
@@ -4510,8 +4942,8 @@
         </w:pict>
       </w:r>
     </w:p>
-    <w:bookmarkEnd w:id="40"/>
-    <w:bookmarkStart w:id="41" w:name="X08b0971ca8da753d502424aa77bd8b10039c9f8"/>
+    <w:bookmarkEnd w:id="41"/>
+    <w:bookmarkStart w:id="42" w:name="X08b0971ca8da753d502424aa77bd8b10039c9f8"/>
     <w:p>
       <w:pPr>
         <w:pStyle w:val="Heading3"/>
@@ -4654,7 +5086,7 @@
               <w:pStyle w:val="Compact"/>
             </w:pPr>
             <w:r>
-              <w:t xml:space="preserve">Importances reflect the surrogate’s learned relationships, not physical causation. Because the three inputs are constrained (GI% + FF% ≤ 100%), their importances are not fully independent.</w:t>
+              <w:t xml:space="preserve">Importances reflect the surrogate’s learned relationships, not physical causation. Because the three inputs are constrained (GI% + FF% ≤ 100%), their importances are not fully independent. Feature importance reflects how strongly variables influence the surrogate predictions within the sampled training space; it does not imply causal importance outside that range.</w:t>
             </w:r>
           </w:p>
         </w:tc>
@@ -4667,9 +5099,9 @@
         </w:pict>
       </w:r>
     </w:p>
-    <w:bookmarkEnd w:id="41"/>
     <w:bookmarkEnd w:id="42"/>
-    <w:bookmarkStart w:id="43" w:name="bar-charts-scenario-tab"/>
+    <w:bookmarkEnd w:id="43"/>
+    <w:bookmarkStart w:id="44" w:name="bar-charts-scenario-tab"/>
     <w:p>
       <w:pPr>
         <w:pStyle w:val="Heading2"/>
@@ -4962,8 +5394,8 @@
         </w:pict>
       </w:r>
     </w:p>
-    <w:bookmarkEnd w:id="43"/>
-    <w:bookmarkStart w:id="44" w:name="map-view-map-view-tab"/>
+    <w:bookmarkEnd w:id="44"/>
+    <w:bookmarkStart w:id="45" w:name="map-view-map-view-tab"/>
     <w:p>
       <w:pPr>
         <w:pStyle w:val="Heading2"/>
@@ -5191,8 +5623,8 @@
         <w:t xml:space="preserve">When heat-priority mode is on, teal/green/red pixels are concentrated in higher-intensity developed areas rather than uniformly distributed.</w:t>
       </w:r>
     </w:p>
-    <w:bookmarkEnd w:id="44"/>
     <w:bookmarkEnd w:id="45"/>
+    <w:bookmarkEnd w:id="46"/>
     <w:sectPr>
       <w:footnotePr>
         <w:numRestart w:val="eachSect"/>
@@ -5303,6 +5735,91 @@
       </w:pPr>
     </w:lvl>
   </w:abstractNum>
+  <w:abstractNum w:abstractNumId="99411">
+    <w:nsid w:val="00A99411"/>
+    <w:multiLevelType w:val="multilevel"/>
+    <w:lvl w:ilvl="0">
+      <w:start w:val="1"/>
+      <w:numFmt w:val="decimal"/>
+      <w:lvlText w:val="%1."/>
+      <w:lvlJc w:val="left"/>
+      <w:pPr>
+        <w:ind w:left="720" w:hanging="360"/>
+      </w:pPr>
+    </w:lvl>
+    <w:lvl w:ilvl="1">
+      <w:start w:val="1"/>
+      <w:numFmt w:val="decimal"/>
+      <w:lvlText w:val="%2."/>
+      <w:lvlJc w:val="left"/>
+      <w:pPr>
+        <w:ind w:left="1440" w:hanging="360"/>
+      </w:pPr>
+    </w:lvl>
+    <w:lvl w:ilvl="2">
+      <w:start w:val="1"/>
+      <w:numFmt w:val="decimal"/>
+      <w:lvlText w:val="%3."/>
+      <w:lvlJc w:val="left"/>
+      <w:pPr>
+        <w:ind w:left="2160" w:hanging="360"/>
+      </w:pPr>
+    </w:lvl>
+    <w:lvl w:ilvl="3">
+      <w:start w:val="1"/>
+      <w:numFmt w:val="decimal"/>
+      <w:lvlText w:val="%4."/>
+      <w:lvlJc w:val="left"/>
+      <w:pPr>
+        <w:ind w:left="2880" w:hanging="360"/>
+      </w:pPr>
+    </w:lvl>
+    <w:lvl w:ilvl="4">
+      <w:start w:val="1"/>
+      <w:numFmt w:val="decimal"/>
+      <w:lvlText w:val="%5."/>
+      <w:lvlJc w:val="left"/>
+      <w:pPr>
+        <w:ind w:left="3600" w:hanging="360"/>
+      </w:pPr>
+    </w:lvl>
+    <w:lvl w:ilvl="5">
+      <w:start w:val="1"/>
+      <w:numFmt w:val="decimal"/>
+      <w:lvlText w:val="%6."/>
+      <w:lvlJc w:val="left"/>
+      <w:pPr>
+        <w:ind w:left="4320" w:hanging="360"/>
+      </w:pPr>
+    </w:lvl>
+    <w:lvl w:ilvl="6">
+      <w:start w:val="1"/>
+      <w:numFmt w:val="decimal"/>
+      <w:lvlText w:val="%7."/>
+      <w:lvlJc w:val="left"/>
+      <w:pPr>
+        <w:ind w:left="5040" w:hanging="360"/>
+      </w:pPr>
+    </w:lvl>
+    <w:lvl w:ilvl="7">
+      <w:start w:val="1"/>
+      <w:numFmt w:val="decimal"/>
+      <w:lvlText w:val="%8."/>
+      <w:lvlJc w:val="left"/>
+      <w:pPr>
+        <w:ind w:left="5760" w:hanging="360"/>
+      </w:pPr>
+    </w:lvl>
+    <w:lvl w:ilvl="8">
+      <w:start w:val="1"/>
+      <w:numFmt w:val="decimal"/>
+      <w:lvlText w:val="%9."/>
+      <w:lvlJc w:val="left"/>
+      <w:pPr>
+        <w:ind w:left="6480" w:hanging="360"/>
+      </w:pPr>
+    </w:lvl>
+  </w:abstractNum>
   <w:abstractNum w:abstractNumId="991">
     <w:nsid w:val="0000A991"/>
     <w:multiLevelType w:val="multilevel"/>
@@ -5410,6 +5927,36 @@
     <w:abstractNumId w:val="990"/>
   </w:num>
   <w:num w:numId="1001">
+    <w:abstractNumId w:val="99411"/>
+    <w:lvlOverride w:ilvl="0">
+      <w:startOverride w:val="1"/>
+    </w:lvlOverride>
+    <w:lvlOverride w:ilvl="1">
+      <w:startOverride w:val="1"/>
+    </w:lvlOverride>
+    <w:lvlOverride w:ilvl="2">
+      <w:startOverride w:val="1"/>
+    </w:lvlOverride>
+    <w:lvlOverride w:ilvl="3">
+      <w:startOverride w:val="1"/>
+    </w:lvlOverride>
+    <w:lvlOverride w:ilvl="4">
+      <w:startOverride w:val="1"/>
+    </w:lvlOverride>
+    <w:lvlOverride w:ilvl="5">
+      <w:startOverride w:val="1"/>
+    </w:lvlOverride>
+    <w:lvlOverride w:ilvl="6">
+      <w:startOverride w:val="1"/>
+    </w:lvlOverride>
+    <w:lvlOverride w:ilvl="7">
+      <w:startOverride w:val="1"/>
+    </w:lvlOverride>
+    <w:lvlOverride w:ilvl="8">
+      <w:startOverride w:val="1"/>
+    </w:lvlOverride>
+  </w:num>
+  <w:num w:numId="1002">
     <w:abstractNumId w:val="991"/>
   </w:num>
 </w:numbering>

</xml_diff>